<commit_message>
Harden source install and station upgrade gate
</commit_message>
<xml_diff>
--- a/docs/FreqInOut Version 2 Upgrade Guide for Current Single Radio Users.docx
+++ b/docs/FreqInOut Version 2 Upgrade Guide for Current Single Radio Users.docx
@@ -77,7 +77,7 @@
           <w:color w:val="1D252C"/>
           <w:sz w:val="22"/>
         </w:rPr>
-        <w:t>Use this guide after FreqInOut 2.0.0 is published in the public repository</w:t>
+        <w:t>Use this guide with FreqInOut 2.0.1 or a later approved release</w:t>
       </w:r>
     </w:p>
     <w:p>
@@ -87,7 +87,7 @@
         <w:jc w:val="left"/>
       </w:pPr>
       <w:r>
-        <w:t>FreqInOut 2 turns multi-radio support into the standard application while keeping one-radio operation fully supported. The upgrade preserves the existing FIO profile, asks before converting it, creates a verified in-app backup, and turns the current station into the first named radio.</w:t>
+        <w:t>FreqInOut 2 uses the same verified installer and neutral launcher for new stations and upgrades. For an existing station, the installer checks and backs up the closed profile before first launch. FIO then requires a short Upgrade Existing Station review that preserves the manufacturer and model and turns the current station into the first named radio.</w:t>
       </w:r>
     </w:p>
     <w:p>
@@ -116,7 +116,7 @@
         <w:rPr>
           <w:b/>
         </w:rPr>
-        <w:t>Read the preparation section before installing the update.</w:t>
+        <w:t>Follow the numbered steps in order. Do not launch FIO unless the installer prints Installation verified.</w:t>
       </w:r>
     </w:p>
     <w:p>
@@ -135,7 +135,7 @@
     </w:p>
     <w:p>
       <w:r>
-        <w:t>The safest upgrade has two recovery points: a manual copy of the current FIO profile before software installation and the backup FIO creates immediately before Multi-Rig setup. Keep both until the upgraded station has operated normally for several sessions.</w:t>
+        <w:t>The upgrade creates two recovery points: a cold verified profile backup made by the installer and the backup FIO creates immediately before station conversion. Keep both until the upgraded station has operated normally for several sessions.</w:t>
       </w:r>
     </w:p>
     <w:p>
@@ -727,19 +727,7 @@
     </w:p>
     <w:p>
       <w:r>
-        <w:t xml:space="preserve">Open the </w:t>
-      </w:r>
-      <w:hyperlink r:id="rId12">
-        <w:r>
-          <w:rPr>
-            <w:color w:val="177EAA"/>
-            <w:u w:val="single"/>
-          </w:rPr>
-          <w:t>FreqInOut Releases page</w:t>
-        </w:r>
-      </w:hyperlink>
-      <w:r>
-        <w:t xml:space="preserve"> and confirm that version 2.0.0 or a later approved version is available. Use only the public repository or an installer attached to its release.</w:t>
+        <w:t>Open the FreqInOut Releases page and confirm that version 2.0.1 or a later approved version is available. Normal operators should use the approved release archive instead of Git branch commands.</w:t>
       </w:r>
     </w:p>
     <w:p>
@@ -789,12 +777,12 @@
         <w:keepNext/>
       </w:pPr>
       <w:r>
-        <w:t>Create a manual profile backup</w:t>
+        <w:t>Let the installer create the verified profile backup</w:t>
       </w:r>
     </w:p>
     <w:p>
       <w:r>
-        <w:t>Copy the entire FIO profile root while FIO is closed. The copy should include the config folder, both SQLite databases, logs, backups, and any FIO-managed instance data below that root. Use the commands in the operating-system section or make the same copy with the file manager.</w:t>
+        <w:t>Run install_freqinout.py while FIO and companion applications are closed. When an existing station is present, the installer checks both FIO databases, copies the config folder, verifies every copied file and database, and prints the retained pre-install backup location.</w:t>
       </w:r>
     </w:p>
     <w:p>
@@ -805,7 +793,7 @@
         <w:t xml:space="preserve">External folders  </w:t>
       </w:r>
       <w:r>
-        <w:t>FIO can reference message, log, BBS, NAS, and companion-application folders outside its profile. Back up important operator-owned locations separately according to your station's normal backup plan.</w:t>
+        <w:t>FIO can reference message, log, BBS, NAS, and companion-application folders outside its profile. The installer does not copy those locations. Keep using the station's normal backup plan for operator-owned external data.</w:t>
       </w:r>
     </w:p>
     <w:p>
@@ -893,7 +881,7 @@
     </w:p>
     <w:p>
       <w:r>
-        <w:t>These steps apply to a normal Linux installation whose FIO checkout is in $HOME/FreqInOut and whose profile is $HOME/.freqinout. Substitute the paths you recorded if your installation is different.</w:t>
+        <w:t>Extract the approved release into a new application folder and keep the previous FIO folder unchanged. The installer automatically uses $HOME/.freqinout unless FREQINOUT_CONFIG_DIR selects a custom profile.</w:t>
       </w:r>
     </w:p>
     <w:p>
@@ -902,7 +890,7 @@
         <w:keepNext/>
       </w:pPr>
       <w:r>
-        <w:t>Back up the Linux profile</w:t>
+        <w:t>Install and verify FIO</w:t>
       </w:r>
     </w:p>
     <w:p>
@@ -917,160 +905,7 @@
           <w:color w:val="1D252C"/>
           <w:sz w:val="18"/>
         </w:rPr>
-        <w:t>mkdir -p "$HOME/FreqInOut-Backups"</w:t>
-      </w:r>
-    </w:p>
-    <w:p>
-      <w:pPr>
-        <w:spacing w:before="20" w:after="20"/>
-        <w:ind w:left="360" w:right="288"/>
-        <w:shd w:fill="F3F5F7"/>
-      </w:pPr>
-      <w:r>
-        <w:rPr>
-          <w:rFonts w:ascii="Consolas" w:hAnsi="Consolas"/>
-          <w:color w:val="1D252C"/>
-          <w:sz w:val="18"/>
-        </w:rPr>
-        <w:t>cp -a "$HOME/.freqinout" "$HOME/FreqInOut-Backups/profile-$(date +%Y%m%d-%H%M%S)"</w:t>
-      </w:r>
-    </w:p>
-    <w:p>
-      <w:r>
-        <w:t>Open the new backup folder and confirm that it contains a config folder before continuing.</w:t>
-      </w:r>
-    </w:p>
-    <w:p>
-      <w:pPr>
-        <w:pStyle w:val="Heading2"/>
-        <w:keepNext/>
-      </w:pPr>
-      <w:r>
-        <w:t>Update a guided installer installation</w:t>
-      </w:r>
-    </w:p>
-    <w:p>
-      <w:pPr>
-        <w:spacing w:before="20" w:after="20"/>
-        <w:ind w:left="360" w:right="288"/>
-        <w:shd w:fill="F3F5F7"/>
-      </w:pPr>
-      <w:r>
-        <w:rPr>
-          <w:rFonts w:ascii="Consolas" w:hAnsi="Consolas"/>
-          <w:color w:val="1D252C"/>
-          <w:sz w:val="18"/>
-        </w:rPr>
-        <w:t>cd "$HOME/FreqInOut"</w:t>
-      </w:r>
-    </w:p>
-    <w:p>
-      <w:pPr>
-        <w:spacing w:before="20" w:after="20"/>
-        <w:ind w:left="360" w:right="288"/>
-        <w:shd w:fill="F3F5F7"/>
-      </w:pPr>
-      <w:r>
-        <w:rPr>
-          <w:rFonts w:ascii="Consolas" w:hAnsi="Consolas"/>
-          <w:color w:val="1D252C"/>
-          <w:sz w:val="18"/>
-        </w:rPr>
-        <w:t>git status --short</w:t>
-      </w:r>
-    </w:p>
-    <w:p>
-      <w:pPr>
-        <w:spacing w:before="20" w:after="20"/>
-        <w:ind w:left="360" w:right="288"/>
-        <w:shd w:fill="F3F5F7"/>
-      </w:pPr>
-      <w:r>
-        <w:rPr>
-          <w:rFonts w:ascii="Consolas" w:hAnsi="Consolas"/>
-          <w:color w:val="1D252C"/>
-          <w:sz w:val="18"/>
-        </w:rPr>
-        <w:t>git pull --ff-only origin main</w:t>
-      </w:r>
-    </w:p>
-    <w:p>
-      <w:pPr>
-        <w:spacing w:before="20" w:after="20"/>
-        <w:ind w:left="360" w:right="288"/>
-        <w:shd w:fill="F3F5F7"/>
-      </w:pPr>
-      <w:r>
-        <w:rPr>
-          <w:rFonts w:ascii="Consolas" w:hAnsi="Consolas"/>
-          <w:color w:val="1D252C"/>
-          <w:sz w:val="18"/>
-        </w:rPr>
-        <w:t>bash install_FreqInOut_linux.sh --dir "$HOME/FreqInOut"</w:t>
-      </w:r>
-    </w:p>
-    <w:p>
-      <w:r>
-        <w:t>The status command should produce no output. If it lists files, stop and ask for help; do not discard local changes. If the existing launcher uses a custom profile root, rerun the installer with the same --config-root value.</w:t>
-      </w:r>
-    </w:p>
-    <w:p>
-      <w:r>
-        <w:t>The Linux installer also records installation activity in $HOME/freqinout-install.log and creates installer backups under $HOME/.local/state/freqinout/backups.</w:t>
-      </w:r>
-    </w:p>
-    <w:p>
-      <w:pPr>
-        <w:pStyle w:val="Heading2"/>
-        <w:keepNext/>
-      </w:pPr>
-      <w:r>
-        <w:t>Update a source installation</w:t>
-      </w:r>
-    </w:p>
-    <w:p>
-      <w:pPr>
-        <w:spacing w:before="20" w:after="20"/>
-        <w:ind w:left="360" w:right="288"/>
-        <w:shd w:fill="F3F5F7"/>
-      </w:pPr>
-      <w:r>
-        <w:rPr>
-          <w:rFonts w:ascii="Consolas" w:hAnsi="Consolas"/>
-          <w:color w:val="1D252C"/>
-          <w:sz w:val="18"/>
-        </w:rPr>
-        <w:t>cd "$HOME/FreqInOut"</w:t>
-      </w:r>
-    </w:p>
-    <w:p>
-      <w:pPr>
-        <w:spacing w:before="20" w:after="20"/>
-        <w:ind w:left="360" w:right="288"/>
-        <w:shd w:fill="F3F5F7"/>
-      </w:pPr>
-      <w:r>
-        <w:rPr>
-          <w:rFonts w:ascii="Consolas" w:hAnsi="Consolas"/>
-          <w:color w:val="1D252C"/>
-          <w:sz w:val="18"/>
-        </w:rPr>
-        <w:t>git status --short</w:t>
-      </w:r>
-    </w:p>
-    <w:p>
-      <w:pPr>
-        <w:spacing w:before="20" w:after="20"/>
-        <w:ind w:left="360" w:right="288"/>
-        <w:shd w:fill="F3F5F7"/>
-      </w:pPr>
-      <w:r>
-        <w:rPr>
-          <w:rFonts w:ascii="Consolas" w:hAnsi="Consolas"/>
-          <w:color w:val="1D252C"/>
-          <w:sz w:val="18"/>
-        </w:rPr>
-        <w:t>git pull --ff-only origin main</w:t>
+        <w:t>cd "$HOME/FreqInOut-2.0.1"</w:t>
       </w:r>
     </w:p>
     <w:p>
@@ -1089,6 +924,20 @@
       </w:r>
     </w:p>
     <w:p>
+      <w:r>
+        <w:t>Continue only after the installer prints Installation verified and a verified backup location for an existing station.</w:t>
+      </w:r>
+    </w:p>
+    <w:p>
+      <w:pPr>
+        <w:pStyle w:val="Heading2"/>
+        <w:keepNext/>
+      </w:pPr>
+      <w:r>
+        <w:t>Launch FIO</w:t>
+      </w:r>
+    </w:p>
+    <w:p>
       <w:pPr>
         <w:spacing w:before="20" w:after="20"/>
         <w:ind w:left="360" w:right="288"/>
@@ -1100,12 +949,116 @@
           <w:color w:val="1D252C"/>
           <w:sz w:val="18"/>
         </w:rPr>
-        <w:t>./.venv/bin/python -m freqinout.main</w:t>
+        <w:t>./start-freqinout.sh</w:t>
+      </w:r>
+    </w:p>
+    <w:p>
+      <w:pPr>
+        <w:spacing w:before="20" w:after="20"/>
+        <w:ind w:left="360" w:right="288"/>
+        <w:shd w:fill="F3F5F7"/>
+      </w:pPr>
+      <w:r>
+        <w:rPr>
+          <w:rFonts w:ascii="Consolas" w:hAnsi="Consolas"/>
+          <w:color w:val="1D252C"/>
+          <w:sz w:val="18"/>
+        </w:rPr>
+        <w:t>The neutral launcher refuses to run when the installation receipt, version, interpreter, or imports do not match.</w:t>
+      </w:r>
+    </w:p>
+    <w:p>
+      <w:pPr>
+        <w:spacing w:before="20" w:after="20"/>
+        <w:ind w:left="360" w:right="288"/>
+        <w:shd w:fill="F3F5F7"/>
+      </w:pPr>
+      <w:r>
+        <w:rPr>
+          <w:rFonts w:ascii="Consolas" w:hAnsi="Consolas"/>
+          <w:color w:val="1D252C"/>
+          <w:sz w:val="18"/>
+        </w:rPr>
+        <w:t>For a guided Linux installation that owns the desktop entry, rerun install_FreqInOut_linux.sh with the same --dir and --config-root values instead.</w:t>
+      </w:r>
+    </w:p>
+    <w:p>
+      <w:pPr>
+        <w:spacing w:before="20" w:after="20"/>
+        <w:ind w:left="360" w:right="288"/>
+        <w:shd w:fill="F3F5F7"/>
+      </w:pPr>
+      <w:r>
+        <w:rPr>
+          <w:rFonts w:ascii="Consolas" w:hAnsi="Consolas"/>
+          <w:color w:val="1D252C"/>
+          <w:sz w:val="18"/>
+        </w:rPr>
+        <w:t>Do not change the profile root during the upgrade.</w:t>
       </w:r>
     </w:p>
     <w:p>
       <w:r>
-        <w:t>Python 3.9 through 3.13 is supported; Python 3.11 is recommended. If the existing installation uses the guided Linux installer and a venv directory rather than .venv, use the guided installer path above.</w:t>
+        <w:t>If any installer step fails, stop. Preserve the terminal output and do not launch FIO.</w:t>
+      </w:r>
+    </w:p>
+    <w:p>
+      <w:r>
+        <w:t>The Linux installer also records installation activity in $HOME/freqinout-install.log and creates installer backups under $HOME/.local/state/freqinout/backups.</w:t>
+      </w:r>
+    </w:p>
+    <w:p>
+      <w:pPr>
+        <w:pStyle w:val="Heading2"/>
+        <w:keepNext/>
+      </w:pPr>
+      <w:r>
+        <w:t>Technical source checkout updates</w:t>
+      </w:r>
+    </w:p>
+    <w:p>
+      <w:pPr>
+        <w:spacing w:before="20" w:after="20"/>
+        <w:ind w:left="360" w:right="288"/>
+        <w:shd w:fill="F3F5F7"/>
+      </w:pPr>
+      <w:r>
+        <w:t>cd "$HOME/FreqInOut"</w:t>
+      </w:r>
+    </w:p>
+    <w:p>
+      <w:pPr>
+        <w:spacing w:before="20" w:after="20"/>
+        <w:ind w:left="360" w:right="288"/>
+        <w:shd w:fill="F3F5F7"/>
+      </w:pPr>
+      <w:r>
+        <w:t>git pull --ff-only origin main</w:t>
+      </w:r>
+    </w:p>
+    <w:p>
+      <w:pPr>
+        <w:spacing w:before="20" w:after="20"/>
+        <w:ind w:left="360" w:right="288"/>
+        <w:shd w:fill="F3F5F7"/>
+      </w:pPr>
+      <w:r>
+        <w:t>python3.11 install_freqinout.py</w:t>
+      </w:r>
+    </w:p>
+    <w:p>
+      <w:pPr>
+        <w:spacing w:before="20" w:after="20"/>
+        <w:ind w:left="360" w:right="288"/>
+        <w:shd w:fill="F3F5F7"/>
+      </w:pPr>
+      <w:r>
+        <w:t>./start-freqinout.sh</w:t>
+      </w:r>
+    </w:p>
+    <w:p>
+      <w:r>
+        <w:t>Python 3.10 through 3.13 is supported; Python 3.11 is recommended. Technical testers may update an approved checkout first, but must still rerun install_freqinout.py and wait for Installation verified.</w:t>
       </w:r>
     </w:p>
     <w:p>
@@ -1157,7 +1110,7 @@
     </w:p>
     <w:p>
       <w:r>
-        <w:t>Use the installer method if the current FIO was installed from a Windows setup package. Use the source method only when the current installation is a Git checkout with a local Python environment.</w:t>
+        <w:t>Download the approved release archive, extract it into a new folder, and keep the previous application folder unchanged. Use the same Windows account so FIO finds the established profile and credential store.</w:t>
       </w:r>
     </w:p>
     <w:p>
@@ -1166,245 +1119,12 @@
         <w:keepNext/>
       </w:pPr>
       <w:r>
-        <w:t>Back up the Windows profile</w:t>
+        <w:t>Install and verify FIO</w:t>
       </w:r>
     </w:p>
     <w:p>
       <w:r>
-        <w:t>Open PowerShell after closing FIO and run the following commands.</w:t>
-      </w:r>
-    </w:p>
-    <w:p>
-      <w:pPr>
-        <w:spacing w:before="20" w:after="20"/>
-        <w:ind w:left="360" w:right="288"/>
-        <w:shd w:fill="F3F5F7"/>
-      </w:pPr>
-      <w:r>
-        <w:rPr>
-          <w:rFonts w:ascii="Consolas" w:hAnsi="Consolas"/>
-          <w:color w:val="1D252C"/>
-          <w:sz w:val="18"/>
-        </w:rPr>
-        <w:t>$profile = Join-Path $env:LOCALAPPDATA "FreqInOut"</w:t>
-      </w:r>
-    </w:p>
-    <w:p>
-      <w:pPr>
-        <w:spacing w:before="20" w:after="20"/>
-        <w:ind w:left="360" w:right="288"/>
-        <w:shd w:fill="F3F5F7"/>
-      </w:pPr>
-      <w:r>
-        <w:rPr>
-          <w:rFonts w:ascii="Consolas" w:hAnsi="Consolas"/>
-          <w:color w:val="1D252C"/>
-          <w:sz w:val="18"/>
-        </w:rPr>
-        <w:t>if (-not (Test-Path $profile)) { $profile = Join-Path $env:APPDATA "FreqInOut" }</w:t>
-      </w:r>
-    </w:p>
-    <w:p>
-      <w:pPr>
-        <w:spacing w:before="20" w:after="20"/>
-        <w:ind w:left="360" w:right="288"/>
-        <w:shd w:fill="F3F5F7"/>
-      </w:pPr>
-      <w:r>
-        <w:rPr>
-          <w:rFonts w:ascii="Consolas" w:hAnsi="Consolas"/>
-          <w:color w:val="1D252C"/>
-          <w:sz w:val="18"/>
-        </w:rPr>
-        <w:t>$stamp = Get-Date -Format "yyyyMMdd-HHmmss"</w:t>
-      </w:r>
-    </w:p>
-    <w:p>
-      <w:pPr>
-        <w:spacing w:before="20" w:after="20"/>
-        <w:ind w:left="360" w:right="288"/>
-        <w:shd w:fill="F3F5F7"/>
-      </w:pPr>
-      <w:r>
-        <w:rPr>
-          <w:rFonts w:ascii="Consolas" w:hAnsi="Consolas"/>
-          <w:color w:val="1D252C"/>
-          <w:sz w:val="18"/>
-        </w:rPr>
-        <w:t>$backup = Join-Path $env:USERPROFILE "FreqInOut-Backups\profile-$stamp"</w:t>
-      </w:r>
-    </w:p>
-    <w:p>
-      <w:pPr>
-        <w:spacing w:before="20" w:after="20"/>
-        <w:ind w:left="360" w:right="288"/>
-        <w:shd w:fill="F3F5F7"/>
-      </w:pPr>
-      <w:r>
-        <w:rPr>
-          <w:rFonts w:ascii="Consolas" w:hAnsi="Consolas"/>
-          <w:color w:val="1D252C"/>
-          <w:sz w:val="18"/>
-        </w:rPr>
-        <w:t>New-Item -ItemType Directory -Path (Split-Path $backup) -Force</w:t>
-      </w:r>
-    </w:p>
-    <w:p>
-      <w:pPr>
-        <w:spacing w:before="20" w:after="20"/>
-        <w:ind w:left="360" w:right="288"/>
-        <w:shd w:fill="F3F5F7"/>
-      </w:pPr>
-      <w:r>
-        <w:rPr>
-          <w:rFonts w:ascii="Consolas" w:hAnsi="Consolas"/>
-          <w:color w:val="1D252C"/>
-          <w:sz w:val="18"/>
-        </w:rPr>
-        <w:t>Copy-Item $profile $backup -Recurse</w:t>
-      </w:r>
-    </w:p>
-    <w:p>
-      <w:r>
-        <w:t>Open the backup path printed in PowerShell or browse to your user profile's FreqInOut-Backups folder and confirm that the copy contains a config folder.</w:t>
-      </w:r>
-    </w:p>
-    <w:p>
-      <w:pPr>
-        <w:pStyle w:val="Heading2"/>
-        <w:keepNext/>
-      </w:pPr>
-      <w:r>
-        <w:t>Update a packaged installation</w:t>
-      </w:r>
-    </w:p>
-    <w:p>
-      <w:pPr>
-        <w:spacing w:after="70"/>
-        <w:ind w:left="432" w:hanging="432"/>
-      </w:pPr>
-      <w:r>
-        <w:rPr>
-          <w:b/>
-        </w:rPr>
-        <w:t xml:space="preserve">1.  </w:t>
-      </w:r>
-      <w:r>
-        <w:t>Download FreqInOut-Setup.exe from the official version 2 release page.</w:t>
-      </w:r>
-    </w:p>
-    <w:p>
-      <w:pPr>
-        <w:spacing w:after="70"/>
-        <w:ind w:left="432" w:hanging="432"/>
-      </w:pPr>
-      <w:r>
-        <w:rPr>
-          <w:b/>
-        </w:rPr>
-        <w:t xml:space="preserve">2.  </w:t>
-      </w:r>
-      <w:r>
-        <w:t>If the release provides a SHA-256 value, compare it before running the installer.</w:t>
-      </w:r>
-    </w:p>
-    <w:p>
-      <w:pPr>
-        <w:spacing w:after="70"/>
-        <w:ind w:left="432" w:hanging="432"/>
-      </w:pPr>
-      <w:r>
-        <w:rPr>
-          <w:b/>
-        </w:rPr>
-        <w:t xml:space="preserve">3.  </w:t>
-      </w:r>
-      <w:r>
-        <w:t>Run the installer while signed in as the same Windows user who operates FIO.</w:t>
-      </w:r>
-    </w:p>
-    <w:p>
-      <w:pPr>
-        <w:spacing w:after="70"/>
-        <w:ind w:left="432" w:hanging="432"/>
-      </w:pPr>
-      <w:r>
-        <w:rPr>
-          <w:b/>
-        </w:rPr>
-        <w:t xml:space="preserve">4.  </w:t>
-      </w:r>
-      <w:r>
-        <w:t>Keep the existing FIO profile. Do not remove the LocalAppData or AppData FreqInOut folder.</w:t>
-      </w:r>
-    </w:p>
-    <w:p>
-      <w:pPr>
-        <w:spacing w:after="70"/>
-        <w:ind w:left="432" w:hanging="432"/>
-      </w:pPr>
-      <w:r>
-        <w:rPr>
-          <w:b/>
-        </w:rPr>
-        <w:t xml:space="preserve">5.  </w:t>
-      </w:r>
-      <w:r>
-        <w:t>Launch FIO from the updated Start menu or desktop shortcut.</w:t>
-      </w:r>
-    </w:p>
-    <w:p>
-      <w:pPr>
-        <w:pStyle w:val="Heading2"/>
-        <w:keepNext/>
-      </w:pPr>
-      <w:r>
-        <w:t>Update a source installation</w:t>
-      </w:r>
-    </w:p>
-    <w:p>
-      <w:pPr>
-        <w:spacing w:before="20" w:after="20"/>
-        <w:ind w:left="360" w:right="288"/>
-        <w:shd w:fill="F3F5F7"/>
-      </w:pPr>
-      <w:r>
-        <w:rPr>
-          <w:rFonts w:ascii="Consolas" w:hAnsi="Consolas"/>
-          <w:color w:val="1D252C"/>
-          <w:sz w:val="18"/>
-        </w:rPr>
-        <w:t>Set-Location "$HOME\FreqInOut"</w:t>
-      </w:r>
-    </w:p>
-    <w:p>
-      <w:pPr>
-        <w:spacing w:before="20" w:after="20"/>
-        <w:ind w:left="360" w:right="288"/>
-        <w:shd w:fill="F3F5F7"/>
-      </w:pPr>
-      <w:r>
-        <w:rPr>
-          <w:rFonts w:ascii="Consolas" w:hAnsi="Consolas"/>
-          <w:color w:val="1D252C"/>
-          <w:sz w:val="18"/>
-        </w:rPr>
-        <w:t>git status --short</w:t>
-      </w:r>
-    </w:p>
-    <w:p>
-      <w:pPr>
-        <w:spacing w:before="20" w:after="20"/>
-        <w:ind w:left="360" w:right="288"/>
-        <w:shd w:fill="F3F5F7"/>
-      </w:pPr>
-      <w:r>
-        <w:rPr>
-          <w:rFonts w:ascii="Consolas" w:hAnsi="Consolas"/>
-          <w:color w:val="1D252C"/>
-          <w:sz w:val="18"/>
-        </w:rPr>
-        <w:t>git pull --ff-only origin main</w:t>
+        <w:t>Open PowerShell in the extracted release folder after closing FIO and companion applications.</w:t>
       </w:r>
     </w:p>
     <w:p>
@@ -1434,12 +1154,194 @@
           <w:color w:val="1D252C"/>
           <w:sz w:val="18"/>
         </w:rPr>
-        <w:t>.\.venv\Scripts\python.exe -m freqinout.main</w:t>
+        <w:t>Continue only after the installer prints Installation verified.</w:t>
+      </w:r>
+    </w:p>
+    <w:p>
+      <w:pPr>
+        <w:spacing w:before="20" w:after="20"/>
+        <w:ind w:left="360" w:right="288"/>
+        <w:shd w:fill="F3F5F7"/>
+      </w:pPr>
+      <w:r>
+        <w:rPr>
+          <w:rFonts w:ascii="Consolas" w:hAnsi="Consolas"/>
+          <w:color w:val="1D252C"/>
+          <w:sz w:val="18"/>
+        </w:rPr>
+        <w:t>For an existing station, also confirm that it prints a verified pre-install backup location.</w:t>
+      </w:r>
+    </w:p>
+    <w:p>
+      <w:pPr>
+        <w:spacing w:before="20" w:after="20"/>
+        <w:ind w:left="360" w:right="288"/>
+        <w:shd w:fill="F3F5F7"/>
+      </w:pPr>
+      <w:r>
+        <w:rPr>
+          <w:rFonts w:ascii="Consolas" w:hAnsi="Consolas"/>
+          <w:color w:val="1D252C"/>
+          <w:sz w:val="18"/>
+        </w:rPr>
+        <w:t>.\start-freqinout.cmd</w:t>
+      </w:r>
+    </w:p>
+    <w:p>
+      <w:pPr>
+        <w:spacing w:before="20" w:after="20"/>
+        <w:ind w:left="360" w:right="288"/>
+        <w:shd w:fill="F3F5F7"/>
+      </w:pPr>
+      <w:r>
+        <w:rPr>
+          <w:rFonts w:ascii="Consolas" w:hAnsi="Consolas"/>
+          <w:color w:val="1D252C"/>
+          <w:sz w:val="18"/>
+        </w:rPr>
+        <w:t>If the installer reports a problem, stop and preserve the complete PowerShell output.</w:t>
+      </w:r>
+    </w:p>
+    <w:p>
+      <w:pPr>
+        <w:spacing w:before="20" w:after="20"/>
+        <w:ind w:left="360" w:right="288"/>
+        <w:shd w:fill="F3F5F7"/>
+      </w:pPr>
+      <w:r>
+        <w:rPr>
+          <w:rFonts w:ascii="Consolas" w:hAnsi="Consolas"/>
+          <w:color w:val="1D252C"/>
+          <w:sz w:val="18"/>
+        </w:rPr>
+        <w:t>Do not use the launcher until the installer succeeds.</w:t>
       </w:r>
     </w:p>
     <w:p>
       <w:r>
-        <w:t>The status command should produce no output. If files are listed, stop and ask for help instead of resetting the checkout. PowerShell activation is not required when the .venv Python executable is called directly.</w:t>
+        <w:t>The neutral launcher checks the installation receipt, version, interpreter, and imports before opening FIO.</w:t>
+      </w:r>
+    </w:p>
+    <w:p>
+      <w:pPr>
+        <w:pStyle w:val="Heading2"/>
+        <w:keepNext/>
+      </w:pPr>
+      <w:r>
+        <w:t>Technical source checkout updates</w:t>
+      </w:r>
+    </w:p>
+    <w:p>
+      <w:pPr>
+        <w:spacing w:after="70"/>
+        <w:ind w:left="432" w:hanging="432"/>
+      </w:pPr>
+      <w:r>
+        <w:rPr>
+          <w:b/>
+        </w:rPr>
+        <w:t>1.  Close FIO and companion applications.</w:t>
+      </w:r>
+      <w:r/>
+    </w:p>
+    <w:p>
+      <w:pPr>
+        <w:spacing w:after="70"/>
+        <w:ind w:left="432" w:hanging="432"/>
+      </w:pPr>
+      <w:r>
+        <w:rPr>
+          <w:b/>
+        </w:rPr>
+        <w:t>2.  Update only the approved branch or release tag.</w:t>
+      </w:r>
+      <w:r/>
+    </w:p>
+    <w:p>
+      <w:pPr>
+        <w:spacing w:after="70"/>
+        <w:ind w:left="432" w:hanging="432"/>
+      </w:pPr>
+      <w:r>
+        <w:rPr>
+          <w:b/>
+        </w:rPr>
+        <w:t>3.  Run py -3.11 install_freqinout.py.</w:t>
+      </w:r>
+      <w:r/>
+    </w:p>
+    <w:p>
+      <w:pPr>
+        <w:spacing w:after="70"/>
+        <w:ind w:left="432" w:hanging="432"/>
+      </w:pPr>
+      <w:r>
+        <w:rPr>
+          <w:b/>
+        </w:rPr>
+        <w:t>4.  Wait for Installation verified.</w:t>
+      </w:r>
+      <w:r/>
+    </w:p>
+    <w:p>
+      <w:pPr>
+        <w:spacing w:after="70"/>
+        <w:ind w:left="432" w:hanging="432"/>
+      </w:pPr>
+      <w:r>
+        <w:rPr>
+          <w:b/>
+        </w:rPr>
+        <w:t>5.  Launch with .\start-freqinout.cmd.</w:t>
+      </w:r>
+      <w:r/>
+    </w:p>
+    <w:p>
+      <w:pPr>
+        <w:keepNext/>
+      </w:pPr>
+      <w:r>
+        <w:t>Set-Location "$HOME\FreqInOut"</w:t>
+      </w:r>
+    </w:p>
+    <w:p>
+      <w:pPr>
+        <w:spacing w:before="20" w:after="20"/>
+        <w:ind w:left="360" w:right="288"/>
+        <w:shd w:fill="F3F5F7"/>
+      </w:pPr>
+      <w:r>
+        <w:t>git pull --ff-only origin main</w:t>
+      </w:r>
+    </w:p>
+    <w:p>
+      <w:pPr>
+        <w:spacing w:before="20" w:after="20"/>
+        <w:ind w:left="360" w:right="288"/>
+        <w:shd w:fill="F3F5F7"/>
+      </w:pPr>
+      <w:r>
+        <w:t>py -3.11 install_freqinout.py</w:t>
+      </w:r>
+    </w:p>
+    <w:p>
+      <w:pPr>
+        <w:spacing w:before="20" w:after="20"/>
+        <w:ind w:left="360" w:right="288"/>
+        <w:shd w:fill="F3F5F7"/>
+      </w:pPr>
+      <w:r>
+        <w:t>Installation verified. Run: .\start-freqinout.cmd</w:t>
+      </w:r>
+    </w:p>
+    <w:p>
+      <w:pPr>
+        <w:spacing w:before="20" w:after="20"/>
+        <w:ind w:left="360" w:right="288"/>
+        <w:shd w:fill="F3F5F7"/>
+      </w:pPr>
+      <w:r>
+        <w:t>.\start-freqinout.cmd</w:t>
       </w:r>
     </w:p>
     <w:p>
@@ -1491,7 +1393,7 @@
     </w:p>
     <w:p>
       <w:r>
-        <w:t>FreqInOut Version 2 supports a source installation on macOS. A signed and notarized application bundle is not assumed by this guide. VarAC and Wine workflows require separate qualification and are not a primary macOS upgrade target.</w:t>
+        <w:t>FreqInOut Version 2 supports a source installation on macOS. Extract the approved release into a new application folder and keep the previous folder unchanged. A signed and notarized bundle is not assumed by this guide.</w:t>
       </w:r>
     </w:p>
     <w:p>
@@ -1500,7 +1402,7 @@
         <w:keepNext/>
       </w:pPr>
       <w:r>
-        <w:t>Back up the macOS profile</w:t>
+        <w:t>Install and verify FIO</w:t>
       </w:r>
     </w:p>
     <w:p>
@@ -1515,81 +1417,7 @@
           <w:color w:val="1D252C"/>
           <w:sz w:val="18"/>
         </w:rPr>
-        <w:t>mkdir -p "$HOME/FreqInOut-Backups"</w:t>
-      </w:r>
-    </w:p>
-    <w:p>
-      <w:pPr>
-        <w:spacing w:before="20" w:after="20"/>
-        <w:ind w:left="360" w:right="288"/>
-        <w:shd w:fill="F3F5F7"/>
-      </w:pPr>
-      <w:r>
-        <w:rPr>
-          <w:rFonts w:ascii="Consolas" w:hAnsi="Consolas"/>
-          <w:color w:val="1D252C"/>
-          <w:sz w:val="18"/>
-        </w:rPr>
-        <w:t>cp -a "$HOME/.freqinout" "$HOME/FreqInOut-Backups/profile-$(date +%Y%m%d-%H%M%S)"</w:t>
-      </w:r>
-    </w:p>
-    <w:p>
-      <w:r>
-        <w:t>Open the backup in Finder and confirm that it contains a config folder before continuing.</w:t>
-      </w:r>
-    </w:p>
-    <w:p>
-      <w:pPr>
-        <w:pStyle w:val="Heading2"/>
-        <w:keepNext/>
-      </w:pPr>
-      <w:r>
-        <w:t>Update the source installation</w:t>
-      </w:r>
-    </w:p>
-    <w:p>
-      <w:pPr>
-        <w:spacing w:before="20" w:after="20"/>
-        <w:ind w:left="360" w:right="288"/>
-        <w:shd w:fill="F3F5F7"/>
-      </w:pPr>
-      <w:r>
-        <w:rPr>
-          <w:rFonts w:ascii="Consolas" w:hAnsi="Consolas"/>
-          <w:color w:val="1D252C"/>
-          <w:sz w:val="18"/>
-        </w:rPr>
-        <w:t>cd "$HOME/FreqInOut"</w:t>
-      </w:r>
-    </w:p>
-    <w:p>
-      <w:pPr>
-        <w:spacing w:before="20" w:after="20"/>
-        <w:ind w:left="360" w:right="288"/>
-        <w:shd w:fill="F3F5F7"/>
-      </w:pPr>
-      <w:r>
-        <w:rPr>
-          <w:rFonts w:ascii="Consolas" w:hAnsi="Consolas"/>
-          <w:color w:val="1D252C"/>
-          <w:sz w:val="18"/>
-        </w:rPr>
-        <w:t>git status --short</w:t>
-      </w:r>
-    </w:p>
-    <w:p>
-      <w:pPr>
-        <w:spacing w:before="20" w:after="20"/>
-        <w:ind w:left="360" w:right="288"/>
-        <w:shd w:fill="F3F5F7"/>
-      </w:pPr>
-      <w:r>
-        <w:rPr>
-          <w:rFonts w:ascii="Consolas" w:hAnsi="Consolas"/>
-          <w:color w:val="1D252C"/>
-          <w:sz w:val="18"/>
-        </w:rPr>
-        <w:t>git pull --ff-only origin main</w:t>
+        <w:t>cd "$HOME/FreqInOut-2.0.1"</w:t>
       </w:r>
     </w:p>
     <w:p>
@@ -1608,23 +1436,32 @@
       </w:r>
     </w:p>
     <w:p>
+      <w:r>
+        <w:t>Continue only after the installer prints Installation verified and a verified backup location for an existing station.</w:t>
+      </w:r>
+    </w:p>
+    <w:p>
+      <w:pPr>
+        <w:pStyle w:val="Heading2"/>
+        <w:keepNext/>
+      </w:pPr>
+      <w:r>
+        <w:t>Launch FIO</w:t>
+      </w:r>
+    </w:p>
+    <w:p>
       <w:pPr>
         <w:spacing w:before="20" w:after="20"/>
         <w:ind w:left="360" w:right="288"/>
         <w:shd w:fill="F3F5F7"/>
       </w:pPr>
       <w:r>
-        <w:rPr>
-          <w:rFonts w:ascii="Consolas" w:hAnsi="Consolas"/>
-          <w:color w:val="1D252C"/>
-          <w:sz w:val="18"/>
-        </w:rPr>
-        <w:t>./.venv/bin/python -m freqinout.main</w:t>
+        <w:t>./start-freqinout.sh</w:t>
       </w:r>
     </w:p>
     <w:p>
       <w:r>
-        <w:t>Install Python 3.11 from python.org or Homebrew if python3.11 is unavailable. Do not use an obsolete system Python. If Git reports local changes, stop and ask for help instead of discarding them.</w:t>
+        <w:t>Install Python 3.11 from python.org or Homebrew if python3.11 is unavailable. Do not use an obsolete system Python. Technical testers may update an approved checkout first, but must still rerun the installer.</w:t>
       </w:r>
     </w:p>
     <w:p>
@@ -1641,7 +1478,7 @@
         <w:pStyle w:val="ListBullet"/>
       </w:pPr>
       <w:r>
-        <w:t>Launch from Terminal using the command above unless an approved Version 2 launcher is already installed.</w:t>
+        <w:t>Launch from Terminal with start-freqinout.sh. The older start-multi-rig.sh name remains only as a compatibility wrapper.</w:t>
       </w:r>
     </w:p>
     <w:p>
@@ -1685,12 +1522,12 @@
         <w:keepNext/>
       </w:pPr>
       <w:r>
-        <w:t>First launch and migration</w:t>
+        <w:t>Upgrade Existing Station</w:t>
       </w:r>
     </w:p>
     <w:p>
       <w:r>
-        <w:t>On the first Version 2 launch, FIO detects the existing single-radio profile but does not convert it until you confirm Multi-Rig setup. You can inspect the proposed result before FIO writes the migration.</w:t>
+        <w:t>Before the main window and runtime services start, FIO detects an existing single-radio profile and opens Upgrade Existing Station. New stations and already-upgraded profiles skip this window.</w:t>
       </w:r>
     </w:p>
     <w:p>
@@ -1702,11 +1539,9 @@
         <w:rPr>
           <w:b/>
         </w:rPr>
-        <w:t xml:space="preserve">1.  </w:t>
+        <w:t>1.  Review or select the radio manufacturer and model.</w:t>
       </w:r>
-      <w:r>
-        <w:t>Open Configuration and find the Multi-Rig Setup card.</w:t>
-      </w:r>
+      <w:r/>
     </w:p>
     <w:p>
       <w:pPr>
@@ -1717,11 +1552,9 @@
         <w:rPr>
           <w:b/>
         </w:rPr>
-        <w:t xml:space="preserve">2.  </w:t>
+        <w:t>2.  Confirm the display name and plan name.</w:t>
       </w:r>
-      <w:r>
-        <w:t>Select Preview Configure Automatically. Review the applications found, proposed local ports, backup coverage, and warnings.</w:t>
-      </w:r>
+      <w:r/>
     </w:p>
     <w:p>
       <w:pPr>
@@ -1732,11 +1565,9 @@
         <w:rPr>
           <w:b/>
         </w:rPr>
-        <w:t xml:space="preserve">3.  </w:t>
+        <w:t>3.  Review the detected software and keep only the applications that belong to this radio.</w:t>
       </w:r>
-      <w:r>
-        <w:t>Select Set up Multi-Rig when the preview matches the current station.</w:t>
-      </w:r>
+      <w:r/>
     </w:p>
     <w:p>
       <w:pPr>
@@ -1747,11 +1578,9 @@
         <w:rPr>
           <w:b/>
         </w:rPr>
-        <w:t xml:space="preserve">4.  </w:t>
+        <w:t>4.  Select Back Up and Upgrade Station.</w:t>
       </w:r>
-      <w:r>
-        <w:t>Choose the correct radio manufacturer and model. Give the first radio a clear name that will remain useful in schedules and Software Administration.</w:t>
-      </w:r>
+      <w:r/>
     </w:p>
     <w:p>
       <w:pPr>
@@ -1762,11 +1591,9 @@
         <w:rPr>
           <w:b/>
         </w:rPr>
-        <w:t xml:space="preserve">5.  </w:t>
+        <w:t>5.  Wait for confirmation that the station upgrade is complete and note the in-app backup location.</w:t>
       </w:r>
-      <w:r>
-        <w:t>Review the detected software roles. Keep only the applications that belong to this radio.</w:t>
-      </w:r>
+      <w:r/>
     </w:p>
     <w:p>
       <w:pPr>
@@ -1777,21 +1604,19 @@
         <w:rPr>
           <w:b/>
         </w:rPr>
-        <w:t xml:space="preserve">6.  </w:t>
+        <w:t>6.  Review the first radio, Software Administration, Schedule Assignment, and Launch Control before enabling automatic launch.</w:t>
       </w:r>
-      <w:r>
-        <w:t>Confirm setup. FIO creates a pre-migration backup before converting the profile.</w:t>
-      </w:r>
+      <w:r/>
     </w:p>
     <w:p>
       <w:r>
         <w:rPr>
           <w:b/>
         </w:rPr>
-        <w:t xml:space="preserve">Safe pause  </w:t>
+        <w:t xml:space="preserve">Exit without changes  </w:t>
       </w:r>
       <w:r>
-        <w:t>Select Not Now if you are not ready. FIO keeps using the current station setup and makes no migration writes. Return to Configuration later and continue Multi-Rig setup.</w:t>
+        <w:t>Select Exit FIO or close the window if you are not ready. FIO makes no migration writes, closes, and requires Upgrade Existing Station again on the next launch.</w:t>
       </w:r>
     </w:p>
     <w:p>
@@ -1802,7 +1627,7 @@
         <w:t xml:space="preserve">Backup requirement  </w:t>
       </w:r>
       <w:r>
-        <w:t>FIO blocks migration when the primary backup cannot be created. Resolve the reported path or permission problem instead of moving or deleting the existing profile.</w:t>
+        <w:t>FIO blocks the upgrade and exits when the primary backup cannot be created. Resolve the reported path, permission, integrity, or disk-space problem and rerun the verified installer before retrying.</w:t>
       </w:r>
     </w:p>
     <w:p>
@@ -2111,7 +1936,7 @@
         <w:pStyle w:val="ListBullet"/>
       </w:pPr>
       <w:r>
-        <w:t>Keep the manual pre-install copy of the profile.</w:t>
+        <w:t>Keep the installer-created pre-install backup and its manifest.</w:t>
       </w:r>
     </w:p>
     <w:p>
@@ -2119,7 +1944,7 @@
         <w:pStyle w:val="ListBullet"/>
       </w:pPr>
       <w:r>
-        <w:t>Keep the FIO pre-migration backup and its manifest.</w:t>
+        <w:t>Keep the FIO in-app pre-migration backup and its manifest.</w:t>
       </w:r>
     </w:p>
     <w:p>
@@ -2183,13 +2008,7 @@
         <w:ind w:left="432" w:hanging="432"/>
       </w:pPr>
       <w:r>
-        <w:rPr>
-          <w:b/>
-        </w:rPr>
-        <w:t xml:space="preserve">3.  </w:t>
-      </w:r>
-      <w:r>
-        <w:t>Rerun the approved installer or source dependency command for the same installation and profile root.</w:t>
+        <w:t>3.  For a dependency or environment failure, rerun the approved installer for the same installation and profile root. For database validation failure, preserve the named database and contact FreqInOut support.</w:t>
       </w:r>
     </w:p>
     <w:p>
@@ -2221,7 +2040,7 @@
         <w:pStyle w:val="ListBullet"/>
       </w:pPr>
       <w:r>
-        <w:t>Use Not Now or close the dialog if setup has not been confirmed. The current single-radio profile remains available.</w:t>
+        <w:t>Select Exit FIO or close the window if the upgrade has not been confirmed. FIO exits without migration writes and presents Upgrade Existing Station again on the next launch.</w:t>
       </w:r>
     </w:p>
     <w:p>
@@ -2259,7 +2078,7 @@
     </w:p>
     <w:p>
       <w:r>
-        <w:t>Close FIO and all companion applications. Restore the complete manual pre-install profile copy before running the previous FIO release. Do not open an older release against a profile that Version 2 has already migrated. Restore program files or reinstall the earlier approved release only after the matching profile has been restored.</w:t>
+        <w:t>Close FIO and all companion applications. Restore the complete installer-created pre-install config copy before running the previous FIO release. Do not open an older release against a profile that Version 2 has already migrated. Restore the retained previous application folder only after the matching profile has been restored.</w:t>
       </w:r>
     </w:p>
     <w:p>
@@ -3097,7 +2916,7 @@
         <w:pStyle w:val="ListBullet"/>
       </w:pPr>
       <w:r>
-        <w:t>Whether the problem occurred before, during, or after Multi-Rig setup</w:t>
+        <w:t>Whether the problem occurred before, during, or after Upgrade Existing Station</w:t>
       </w:r>
     </w:p>
     <w:p>
@@ -3156,7 +2975,7 @@
     </w:p>
     <w:p>
       <w:r>
-        <w:t>Complete this page after the station has restarted successfully. Keep it with the two backup locations until the upgrade is accepted.</w:t>
+        <w:t>Complete this page after the station has restarted successfully. Keep it with both backup locations until the upgrade is accepted.</w:t>
       </w:r>
     </w:p>
     <w:p>
@@ -3164,7 +2983,7 @@
         <w:pStyle w:val="ListBullet"/>
       </w:pPr>
       <w:r>
-        <w:t>[ ] Manual pre-install profile backup exists</w:t>
+        <w:t>[ ] Installer printed Installation verified</w:t>
       </w:r>
     </w:p>
     <w:p>
@@ -3172,7 +2991,7 @@
         <w:pStyle w:val="ListBullet"/>
       </w:pPr>
       <w:r>
-        <w:t>[ ] Version 2 application starts from the intended installation</w:t>
+        <w:t>[ ] Verified pre-install profile backup and manifest exist</w:t>
       </w:r>
     </w:p>
     <w:p>
@@ -3180,7 +2999,7 @@
         <w:pStyle w:val="ListBullet"/>
       </w:pPr>
       <w:r>
-        <w:t>[ ] Multi-Rig preview was reviewed before confirmation</w:t>
+        <w:t>[ ] Upgrade Existing Station identity and software were reviewed</w:t>
       </w:r>
     </w:p>
     <w:p>
@@ -3188,7 +3007,7 @@
         <w:pStyle w:val="ListBullet"/>
       </w:pPr>
       <w:r>
-        <w:t>[ ] FIO pre-migration backup and manifest exist</w:t>
+        <w:t>[ ] FIO in-app pre-migration backup and manifest exist</w:t>
       </w:r>
     </w:p>
     <w:p>
@@ -3282,11 +3101,9 @@
         <w:rPr>
           <w:b/>
         </w:rPr>
-        <w:t xml:space="preserve">Manual profile backup path  </w:t>
+        <w:t>Verified pre-install backup path  __________________________________________________________________________</w:t>
       </w:r>
-      <w:r>
-        <w:t>______________________________________________________________________________</w:t>
-      </w:r>
+      <w:r/>
     </w:p>
     <w:p>
       <w:pPr>

</xml_diff>